<commit_message>
Construccion de arena y modo de juego mercenaries
</commit_message>
<xml_diff>
--- a/DesignDocuments/GAS_Arquitectura.docx
+++ b/DesignDocuments/GAS_Arquitectura.docx
@@ -2293,6 +2293,26 @@
     </w:p>
     <w:p>
       <w:pPr>
+        <w:spacing w:after="80"/>
+      </w:pPr>
+    </w:p>
+    <w:p>
+      <w:pPr>
+        <w:spacing w:after="120" w:line="276"/>
+      </w:pPr>
+      <w:r>
+        <w:rPr>
+          <w:b/>
+          <w:bCs/>
+        </w:rPr>
+        <w:t xml:space="preserve">`TargetVFX`</w:t>
+      </w:r>
+      <w:r>
+        <w:t xml:space="preserve"> (con su offset, rotación y escala) es el efecto visual que aparece SOBRE el personaje mientras el efecto está activo, instanciado como hijo suyo para que lo siga. Es el camino corto para un aura o un brillo de buff sin escribir código: se configura en el propio GE y la capa de red lo replica a todos los peers.</w:t>
+      </w:r>
+    </w:p>
+    <w:p>
+      <w:pPr>
         <w:pStyle w:val="Heading1"/>
         <w:spacing w:after="160" w:before="360"/>
       </w:pPr>
@@ -3628,7 +3648,7 @@
                 <w:sz w:val="20"/>
                 <w:szCs w:val="20"/>
               </w:rPr>
-              <w:t xml:space="preserve">Resta a la Vida</w:t>
+              <w:t xml:space="preserve">Escudo que cura</w:t>
             </w:r>
           </w:p>
         </w:tc>
@@ -3659,14 +3679,85 @@
                 <w:sz w:val="18"/>
                 <w:szCs w:val="18"/>
               </w:rPr>
-              <w:t xml:space="preserve">Status_Immortal</w:t>
-            </w:r>
-            <w:r>
-              <w:rPr>
-                <w:sz w:val="20"/>
-                <w:szCs w:val="20"/>
-              </w:rPr>
-              <w:t xml:space="preserve"> la vida no baja de 1. Si llega a 0, dispara </w:t>
+              <w:t xml:space="preserve">Status_HealShield</w:t>
+            </w:r>
+            <w:r>
+              <w:rPr>
+                <w:sz w:val="20"/>
+                <w:szCs w:val="20"/>
+              </w:rPr>
+              <w:t xml:space="preserve">, lo que el escudo alcanzó a frenar vuelve como VIDA (ver 5.4).</w:t>
+            </w:r>
+          </w:p>
+        </w:tc>
+      </w:tr>
+      <w:tr>
+        <w:tc>
+          <w:tcPr>
+            <w:tcW w:type="dxa" w:w="500"/>
+            <w:tcMar>
+              <w:top w:type="dxa" w:w="60"/>
+              <w:left w:type="dxa" w:w="100"/>
+              <w:bottom w:type="dxa" w:w="60"/>
+              <w:right w:type="dxa" w:w="100"/>
+            </w:tcMar>
+          </w:tcPr>
+          <w:p>
+            <w:pPr>
+              <w:spacing w:after="0"/>
+            </w:pPr>
+            <w:r>
+              <w:rPr>
+                <w:sz w:val="20"/>
+                <w:szCs w:val="20"/>
+              </w:rPr>
+              <w:t xml:space="preserve">8</w:t>
+            </w:r>
+          </w:p>
+        </w:tc>
+        <w:tc>
+          <w:tcPr>
+            <w:tcW w:type="dxa" w:w="2300"/>
+            <w:tcMar>
+              <w:top w:type="dxa" w:w="60"/>
+              <w:left w:type="dxa" w:w="100"/>
+              <w:bottom w:type="dxa" w:w="60"/>
+              <w:right w:type="dxa" w:w="100"/>
+            </w:tcMar>
+          </w:tcPr>
+          <w:p>
+            <w:pPr>
+              <w:spacing w:after="0"/>
+            </w:pPr>
+            <w:r>
+              <w:rPr>
+                <w:sz w:val="20"/>
+                <w:szCs w:val="20"/>
+              </w:rPr>
+              <w:t xml:space="preserve">Resta a la Vida</w:t>
+            </w:r>
+          </w:p>
+        </w:tc>
+        <w:tc>
+          <w:tcPr>
+            <w:tcW w:type="dxa" w:w="6600"/>
+            <w:tcMar>
+              <w:top w:type="dxa" w:w="60"/>
+              <w:left w:type="dxa" w:w="100"/>
+              <w:bottom w:type="dxa" w:w="60"/>
+              <w:right w:type="dxa" w:w="100"/>
+            </w:tcMar>
+          </w:tcPr>
+          <w:p>
+            <w:pPr>
+              <w:spacing w:after="0"/>
+            </w:pPr>
+            <w:r>
+              <w:rPr>
+                <w:sz w:val="20"/>
+                <w:szCs w:val="20"/>
+              </w:rPr>
+              <w:t xml:space="preserve">Con </w:t>
             </w:r>
             <w:r>
               <w:rPr>
@@ -3674,85 +3765,14 @@
                 <w:sz w:val="18"/>
                 <w:szCs w:val="18"/>
               </w:rPr>
-              <w:t xml:space="preserve">Die()</w:t>
-            </w:r>
-            <w:r>
-              <w:rPr>
-                <w:sz w:val="20"/>
-                <w:szCs w:val="20"/>
-              </w:rPr>
-              <w:t xml:space="preserve">.</w:t>
-            </w:r>
-          </w:p>
-        </w:tc>
-      </w:tr>
-      <w:tr>
-        <w:tc>
-          <w:tcPr>
-            <w:tcW w:type="dxa" w:w="500"/>
-            <w:tcMar>
-              <w:top w:type="dxa" w:w="60"/>
-              <w:left w:type="dxa" w:w="100"/>
-              <w:bottom w:type="dxa" w:w="60"/>
-              <w:right w:type="dxa" w:w="100"/>
-            </w:tcMar>
-          </w:tcPr>
-          <w:p>
-            <w:pPr>
-              <w:spacing w:after="0"/>
-            </w:pPr>
-            <w:r>
-              <w:rPr>
-                <w:sz w:val="20"/>
-                <w:szCs w:val="20"/>
-              </w:rPr>
-              <w:t xml:space="preserve">8</w:t>
-            </w:r>
-          </w:p>
-        </w:tc>
-        <w:tc>
-          <w:tcPr>
-            <w:tcW w:type="dxa" w:w="2300"/>
-            <w:tcMar>
-              <w:top w:type="dxa" w:w="60"/>
-              <w:left w:type="dxa" w:w="100"/>
-              <w:bottom w:type="dxa" w:w="60"/>
-              <w:right w:type="dxa" w:w="100"/>
-            </w:tcMar>
-          </w:tcPr>
-          <w:p>
-            <w:pPr>
-              <w:spacing w:after="0"/>
-            </w:pPr>
-            <w:r>
-              <w:rPr>
-                <w:sz w:val="20"/>
-                <w:szCs w:val="20"/>
-              </w:rPr>
-              <w:t xml:space="preserve">Robo de vida</w:t>
-            </w:r>
-          </w:p>
-        </w:tc>
-        <w:tc>
-          <w:tcPr>
-            <w:tcW w:type="dxa" w:w="6600"/>
-            <w:tcMar>
-              <w:top w:type="dxa" w:w="60"/>
-              <w:left w:type="dxa" w:w="100"/>
-              <w:bottom w:type="dxa" w:w="60"/>
-              <w:right w:type="dxa" w:w="100"/>
-            </w:tcMar>
-          </w:tcPr>
-          <w:p>
-            <w:pPr>
-              <w:spacing w:after="0"/>
-            </w:pPr>
-            <w:r>
-              <w:rPr>
-                <w:sz w:val="20"/>
-                <w:szCs w:val="20"/>
-              </w:rPr>
-              <w:t xml:space="preserve">El atacante se cura por el daño que pasó × su </w:t>
+              <w:t xml:space="preserve">Status_Immortal</w:t>
+            </w:r>
+            <w:r>
+              <w:rPr>
+                <w:sz w:val="20"/>
+                <w:szCs w:val="20"/>
+              </w:rPr>
+              <w:t xml:space="preserve"> la vida no baja de 1. Si llega a 0, dispara </w:t>
             </w:r>
             <w:r>
               <w:rPr>
@@ -3760,7 +3780,7 @@
                 <w:sz w:val="18"/>
                 <w:szCs w:val="18"/>
               </w:rPr>
-              <w:t xml:space="preserve">LifeSteal</w:t>
+              <w:t xml:space="preserve">Die()</w:t>
             </w:r>
             <w:r>
               <w:rPr>
@@ -3793,6 +3813,92 @@
                 <w:szCs w:val="20"/>
               </w:rPr>
               <w:t xml:space="preserve">9</w:t>
+            </w:r>
+          </w:p>
+        </w:tc>
+        <w:tc>
+          <w:tcPr>
+            <w:tcW w:type="dxa" w:w="2300"/>
+            <w:tcMar>
+              <w:top w:type="dxa" w:w="60"/>
+              <w:left w:type="dxa" w:w="100"/>
+              <w:bottom w:type="dxa" w:w="60"/>
+              <w:right w:type="dxa" w:w="100"/>
+            </w:tcMar>
+          </w:tcPr>
+          <w:p>
+            <w:pPr>
+              <w:spacing w:after="0"/>
+            </w:pPr>
+            <w:r>
+              <w:rPr>
+                <w:sz w:val="20"/>
+                <w:szCs w:val="20"/>
+              </w:rPr>
+              <w:t xml:space="preserve">Robo de vida</w:t>
+            </w:r>
+          </w:p>
+        </w:tc>
+        <w:tc>
+          <w:tcPr>
+            <w:tcW w:type="dxa" w:w="6600"/>
+            <w:tcMar>
+              <w:top w:type="dxa" w:w="60"/>
+              <w:left w:type="dxa" w:w="100"/>
+              <w:bottom w:type="dxa" w:w="60"/>
+              <w:right w:type="dxa" w:w="100"/>
+            </w:tcMar>
+          </w:tcPr>
+          <w:p>
+            <w:pPr>
+              <w:spacing w:after="0"/>
+            </w:pPr>
+            <w:r>
+              <w:rPr>
+                <w:sz w:val="20"/>
+                <w:szCs w:val="20"/>
+              </w:rPr>
+              <w:t xml:space="preserve">El atacante se cura por el daño que pasó × su </w:t>
+            </w:r>
+            <w:r>
+              <w:rPr>
+                <w:rFonts w:ascii="Consolas" w:cs="Consolas" w:eastAsia="Consolas" w:hAnsi="Consolas"/>
+                <w:sz w:val="18"/>
+                <w:szCs w:val="18"/>
+              </w:rPr>
+              <w:t xml:space="preserve">LifeSteal</w:t>
+            </w:r>
+            <w:r>
+              <w:rPr>
+                <w:sz w:val="20"/>
+                <w:szCs w:val="20"/>
+              </w:rPr>
+              <w:t xml:space="preserve">.</w:t>
+            </w:r>
+          </w:p>
+        </w:tc>
+      </w:tr>
+      <w:tr>
+        <w:tc>
+          <w:tcPr>
+            <w:tcW w:type="dxa" w:w="500"/>
+            <w:tcMar>
+              <w:top w:type="dxa" w:w="60"/>
+              <w:left w:type="dxa" w:w="100"/>
+              <w:bottom w:type="dxa" w:w="60"/>
+              <w:right w:type="dxa" w:w="100"/>
+            </w:tcMar>
+          </w:tcPr>
+          <w:p>
+            <w:pPr>
+              <w:spacing w:after="0"/>
+            </w:pPr>
+            <w:r>
+              <w:rPr>
+                <w:sz w:val="20"/>
+                <w:szCs w:val="20"/>
+              </w:rPr>
+              <w:t xml:space="preserve">10</w:t>
             </w:r>
           </w:p>
         </w:tc>
@@ -4209,7 +4315,95 @@
           <w:sz w:val="26"/>
           <w:szCs w:val="26"/>
         </w:rPr>
-        <w:t xml:space="preserve">5.4 Ejemplo numérico</w:t>
+        <w:t xml:space="preserve">5.4 El escudo que cura</w:t>
+      </w:r>
+    </w:p>
+    <w:p>
+      <w:pPr>
+        <w:spacing w:after="120" w:line="276"/>
+      </w:pPr>
+      <w:r>
+        <w:t xml:space="preserve">Con el tag </w:t>
+      </w:r>
+      <w:r>
+        <w:rPr>
+          <w:rFonts w:ascii="Consolas" w:cs="Consolas" w:eastAsia="Consolas" w:hAnsi="Consolas"/>
+          <w:sz w:val="20"/>
+          <w:szCs w:val="20"/>
+        </w:rPr>
+        <w:t xml:space="preserve">Status_HealShield</w:t>
+      </w:r>
+      <w:r>
+        <w:t xml:space="preserve"> activo, el daño que el escudo neutraliza no solo no duele: </w:t>
+      </w:r>
+      <w:r>
+        <w:rPr>
+          <w:b/>
+          <w:bCs/>
+        </w:rPr>
+        <w:t xml:space="preserve">vuelve como vida</w:t>
+      </w:r>
+      <w:r>
+        <w:t xml:space="preserve">. El escudo se gasta igual, así que es un intercambio — un escudo de 50 contra un golpe de 60 cura 50, se rompe, y los 10 restantes entran normal.</w:t>
+      </w:r>
+    </w:p>
+    <w:p>
+      <w:pPr>
+        <w:spacing w:after="120" w:line="276"/>
+      </w:pPr>
+      <w:r>
+        <w:t xml:space="preserve">Se cura el </w:t>
+      </w:r>
+      <w:r>
+        <w:rPr>
+          <w:b/>
+          <w:bCs/>
+        </w:rPr>
+        <w:t xml:space="preserve">daño neutralizado</w:t>
+      </w:r>
+      <w:r>
+        <w:t xml:space="preserve">, no los puntos de escudo gastados. Los dos números solo se separan con daño MÁGICO, que cuesta el doble de escudo: 50 de escudo frenan 25 de magia, y son 25 los que se curan.</w:t>
+      </w:r>
+    </w:p>
+    <w:p>
+      <w:pPr>
+        <w:pBdr>
+          <w:left w:val="single" w:color="E0A800" w:sz="14" w:space="6"/>
+        </w:pBdr>
+        <w:shd w:fill="FFF6DA" w:val="clear"/>
+        <w:spacing w:after="160" w:before="100"/>
+        <w:ind w:left="144" w:right="144"/>
+      </w:pPr>
+      <w:r>
+        <w:rPr>
+          <w:sz w:val="20"/>
+          <w:szCs w:val="20"/>
+        </w:rPr>
+        <w:t xml:space="preserve">Esa asimetría es deliberada, no un descuido de la conversión: el escudo es mágico, así que las clases de daño mágico son su contra natural — le rompen el doble de escudo por punto de daño y, al frenarse menos daño, el dueño se cura menos. Es el mismo hecho visto dos veces, y hace que un Mago sea la respuesta a un Paladín de la Conquista.</w:t>
+      </w:r>
+    </w:p>
+    <w:p>
+      <w:pPr>
+        <w:spacing w:after="120" w:line="276"/>
+      </w:pPr>
+      <w:r>
+        <w:t xml:space="preserve">El tag lo trae el mismo GE que otorga el escudo, así que al agotarse el escudo la curación deja de sumar sola aunque al tag le quede duración. Lo usan Cubrir con escudo del Juramento de la conquista y, más adelante, la defensa mejorada del Monje.</w:t>
+      </w:r>
+    </w:p>
+    <w:p>
+      <w:pPr>
+        <w:pStyle w:val="Heading2"/>
+        <w:spacing w:after="120" w:before="280"/>
+      </w:pPr>
+      <w:r>
+        <w:rPr>
+          <w:b/>
+          <w:bCs/>
+          <w:color w:val="2E74B5"/>
+          <w:sz w:val="26"/>
+          <w:szCs w:val="26"/>
+        </w:rPr>
+        <w:t xml:space="preserve">5.5 Ejemplo numérico</w:t>
       </w:r>
     </w:p>
     <w:p>
@@ -8471,6 +8665,55 @@
           </w:p>
         </w:tc>
       </w:tr>
+      <w:tr>
+        <w:tc>
+          <w:tcPr>
+            <w:tcW w:type="dxa" w:w="2600"/>
+            <w:tcMar>
+              <w:top w:type="dxa" w:w="60"/>
+              <w:left w:type="dxa" w:w="100"/>
+              <w:bottom w:type="dxa" w:w="60"/>
+              <w:right w:type="dxa" w:w="100"/>
+            </w:tcMar>
+          </w:tcPr>
+          <w:p>
+            <w:pPr>
+              <w:spacing w:after="0"/>
+            </w:pPr>
+            <w:r>
+              <w:rPr>
+                <w:rFonts w:ascii="Consolas" w:cs="Consolas" w:eastAsia="Consolas" w:hAnsi="Consolas"/>
+                <w:sz w:val="18"/>
+                <w:szCs w:val="18"/>
+              </w:rPr>
+              <w:t xml:space="preserve">Status_HealShield</w:t>
+            </w:r>
+          </w:p>
+        </w:tc>
+        <w:tc>
+          <w:tcPr>
+            <w:tcW w:type="dxa" w:w="6800"/>
+            <w:tcMar>
+              <w:top w:type="dxa" w:w="60"/>
+              <w:left w:type="dxa" w:w="100"/>
+              <w:bottom w:type="dxa" w:w="60"/>
+              <w:right w:type="dxa" w:w="100"/>
+            </w:tcMar>
+          </w:tcPr>
+          <w:p>
+            <w:pPr>
+              <w:spacing w:after="0"/>
+            </w:pPr>
+            <w:r>
+              <w:rPr>
+                <w:sz w:val="20"/>
+                <w:szCs w:val="20"/>
+              </w:rPr>
+              <w:t xml:space="preserve">Lo que el escudo frena vuelve como vida (ver 5.4).</w:t>
+            </w:r>
+          </w:p>
+        </w:tc>
+      </w:tr>
     </w:tbl>
     <w:p>
       <w:pPr>
@@ -8485,7 +8728,7 @@
           <w:sz w:val="26"/>
           <w:szCs w:val="26"/>
         </w:rPr>
-        <w:t xml:space="preserve">9.3 Marcas y estados</w:t>
+        <w:t xml:space="preserve">9.2.1 Movimiento</w:t>
       </w:r>
     </w:p>
     <w:tbl>
@@ -8582,7 +8825,7 @@
                 <w:sz w:val="18"/>
                 <w:szCs w:val="18"/>
               </w:rPr>
-              <w:t xml:space="preserve">Status_Wound</w:t>
+              <w:t xml:space="preserve">Status_Feather_Fall</w:t>
             </w:r>
           </w:p>
         </w:tc>
@@ -8605,7 +8848,113 @@
                 <w:sz w:val="20"/>
                 <w:szCs w:val="20"/>
               </w:rPr>
-              <w:t xml:space="preserve">Heridas del Pícaro: daño con el tiempo, apilable, explota al tope.</w:t>
+              <w:t xml:space="preserve">Caída de pluma: se cae más lento y se puede volver a impulsar en el aire sin límite mientras dure, como un aleteo. </w:t>
+            </w:r>
+            <w:r>
+              <w:rPr>
+                <w:b/>
+                <w:bCs/>
+                <w:sz w:val="20"/>
+                <w:szCs w:val="20"/>
+              </w:rPr>
+              <w:t xml:space="preserve">No es volar libremente</w:t>
+            </w:r>
+            <w:r>
+              <w:rPr>
+                <w:sz w:val="20"/>
+                <w:szCs w:val="20"/>
+              </w:rPr>
+              <w:t xml:space="preserve"> — un vuelo con control vertical sostenido sería un tag aparte.</w:t>
+            </w:r>
+          </w:p>
+        </w:tc>
+      </w:tr>
+    </w:tbl>
+    <w:p>
+      <w:pPr>
+        <w:pStyle w:val="Heading2"/>
+        <w:spacing w:after="120" w:before="280"/>
+      </w:pPr>
+      <w:r>
+        <w:rPr>
+          <w:b/>
+          <w:bCs/>
+          <w:color w:val="2E74B5"/>
+          <w:sz w:val="26"/>
+          <w:szCs w:val="26"/>
+        </w:rPr>
+        <w:t xml:space="preserve">9.3 Marcas y estados</w:t>
+      </w:r>
+    </w:p>
+    <w:tbl>
+      <w:tblPr>
+        <w:tblW w:type="dxa" w:w="9400"/>
+        <w:tblBorders>
+          <w:top w:val="single" w:color="auto" w:sz="4"/>
+          <w:left w:val="single" w:color="auto" w:sz="4"/>
+          <w:bottom w:val="single" w:color="auto" w:sz="4"/>
+          <w:right w:val="single" w:color="auto" w:sz="4"/>
+          <w:insideH w:val="single" w:color="auto" w:sz="4"/>
+          <w:insideV w:val="single" w:color="auto" w:sz="4"/>
+        </w:tblBorders>
+      </w:tblPr>
+      <w:tblGrid>
+        <w:gridCol w:w="2600"/>
+        <w:gridCol w:w="6800"/>
+      </w:tblGrid>
+      <w:tr>
+        <w:trPr>
+          <w:tblHeader/>
+        </w:trPr>
+        <w:tc>
+          <w:tcPr>
+            <w:tcW w:type="dxa" w:w="2600"/>
+            <w:shd w:fill="DCE6F1" w:val="clear"/>
+            <w:tcMar>
+              <w:top w:type="dxa" w:w="60"/>
+              <w:left w:type="dxa" w:w="100"/>
+              <w:bottom w:type="dxa" w:w="60"/>
+              <w:right w:type="dxa" w:w="100"/>
+            </w:tcMar>
+          </w:tcPr>
+          <w:p>
+            <w:pPr>
+              <w:spacing w:after="0"/>
+            </w:pPr>
+            <w:r>
+              <w:rPr>
+                <w:b/>
+                <w:bCs/>
+                <w:sz w:val="20"/>
+                <w:szCs w:val="20"/>
+              </w:rPr>
+              <w:t xml:space="preserve">Tag</w:t>
+            </w:r>
+          </w:p>
+        </w:tc>
+        <w:tc>
+          <w:tcPr>
+            <w:tcW w:type="dxa" w:w="6800"/>
+            <w:shd w:fill="DCE6F1" w:val="clear"/>
+            <w:tcMar>
+              <w:top w:type="dxa" w:w="60"/>
+              <w:left w:type="dxa" w:w="100"/>
+              <w:bottom w:type="dxa" w:w="60"/>
+              <w:right w:type="dxa" w:w="100"/>
+            </w:tcMar>
+          </w:tcPr>
+          <w:p>
+            <w:pPr>
+              <w:spacing w:after="0"/>
+            </w:pPr>
+            <w:r>
+              <w:rPr>
+                <w:b/>
+                <w:bCs/>
+                <w:sz w:val="20"/>
+                <w:szCs w:val="20"/>
+              </w:rPr>
+              <w:t xml:space="preserve">Qué hace</w:t>
             </w:r>
           </w:p>
         </w:tc>
@@ -8631,71 +8980,71 @@
                 <w:sz w:val="18"/>
                 <w:szCs w:val="18"/>
               </w:rPr>
-              <w:t xml:space="preserve">Status_Poison</w:t>
-            </w:r>
-            <w:r>
-              <w:rPr>
-                <w:sz w:val="20"/>
-                <w:szCs w:val="20"/>
-              </w:rPr>
-              <w:t xml:space="preserve"> / </w:t>
-            </w:r>
+              <w:t xml:space="preserve">Status_Wound</w:t>
+            </w:r>
+          </w:p>
+        </w:tc>
+        <w:tc>
+          <w:tcPr>
+            <w:tcW w:type="dxa" w:w="6800"/>
+            <w:tcMar>
+              <w:top w:type="dxa" w:w="60"/>
+              <w:left w:type="dxa" w:w="100"/>
+              <w:bottom w:type="dxa" w:w="60"/>
+              <w:right w:type="dxa" w:w="100"/>
+            </w:tcMar>
+          </w:tcPr>
+          <w:p>
+            <w:pPr>
+              <w:spacing w:after="0"/>
+            </w:pPr>
+            <w:r>
+              <w:rPr>
+                <w:sz w:val="20"/>
+                <w:szCs w:val="20"/>
+              </w:rPr>
+              <w:t xml:space="preserve">Heridas del Pícaro: daño con el tiempo, apilable, explota al tope.</w:t>
+            </w:r>
+          </w:p>
+        </w:tc>
+      </w:tr>
+      <w:tr>
+        <w:tc>
+          <w:tcPr>
+            <w:tcW w:type="dxa" w:w="2600"/>
+            <w:tcMar>
+              <w:top w:type="dxa" w:w="60"/>
+              <w:left w:type="dxa" w:w="100"/>
+              <w:bottom w:type="dxa" w:w="60"/>
+              <w:right w:type="dxa" w:w="100"/>
+            </w:tcMar>
+          </w:tcPr>
+          <w:p>
+            <w:pPr>
+              <w:spacing w:after="0"/>
+            </w:pPr>
             <w:r>
               <w:rPr>
                 <w:rFonts w:ascii="Consolas" w:cs="Consolas" w:eastAsia="Consolas" w:hAnsi="Consolas"/>
                 <w:sz w:val="18"/>
                 <w:szCs w:val="18"/>
               </w:rPr>
-              <w:t xml:space="preserve">Status_Burning</w:t>
-            </w:r>
-          </w:p>
-        </w:tc>
-        <w:tc>
-          <w:tcPr>
-            <w:tcW w:type="dxa" w:w="6800"/>
-            <w:tcMar>
-              <w:top w:type="dxa" w:w="60"/>
-              <w:left w:type="dxa" w:w="100"/>
-              <w:bottom w:type="dxa" w:w="60"/>
-              <w:right w:type="dxa" w:w="100"/>
-            </w:tcMar>
-          </w:tcPr>
-          <w:p>
-            <w:pPr>
-              <w:spacing w:after="0"/>
-            </w:pPr>
-            <w:r>
-              <w:rPr>
-                <w:sz w:val="20"/>
-                <w:szCs w:val="20"/>
-              </w:rPr>
-              <w:t xml:space="preserve">Daño con el tiempo.</w:t>
-            </w:r>
-          </w:p>
-        </w:tc>
-      </w:tr>
-      <w:tr>
-        <w:tc>
-          <w:tcPr>
-            <w:tcW w:type="dxa" w:w="2600"/>
-            <w:tcMar>
-              <w:top w:type="dxa" w:w="60"/>
-              <w:left w:type="dxa" w:w="100"/>
-              <w:bottom w:type="dxa" w:w="60"/>
-              <w:right w:type="dxa" w:w="100"/>
-            </w:tcMar>
-          </w:tcPr>
-          <w:p>
-            <w:pPr>
-              <w:spacing w:after="0"/>
-            </w:pPr>
+              <w:t xml:space="preserve">Status_Poison</w:t>
+            </w:r>
+            <w:r>
+              <w:rPr>
+                <w:sz w:val="20"/>
+                <w:szCs w:val="20"/>
+              </w:rPr>
+              <w:t xml:space="preserve"> / </w:t>
+            </w:r>
             <w:r>
               <w:rPr>
                 <w:rFonts w:ascii="Consolas" w:cs="Consolas" w:eastAsia="Consolas" w:hAnsi="Consolas"/>
                 <w:sz w:val="18"/>
                 <w:szCs w:val="18"/>
               </w:rPr>
-              <w:t xml:space="preserve">Status_Slow</w:t>
+              <w:t xml:space="preserve">Status_Burning</w:t>
             </w:r>
           </w:p>
         </w:tc>
@@ -8718,7 +9067,7 @@
                 <w:sz w:val="20"/>
                 <w:szCs w:val="20"/>
               </w:rPr>
-              <w:t xml:space="preserve">Ralentización.</w:t>
+              <w:t xml:space="preserve">Daño con el tiempo.</w:t>
             </w:r>
           </w:p>
         </w:tc>
@@ -8744,7 +9093,7 @@
                 <w:sz w:val="18"/>
                 <w:szCs w:val="18"/>
               </w:rPr>
-              <w:t xml:space="preserve">Status_Invisible</w:t>
+              <w:t xml:space="preserve">Status_Slow</w:t>
             </w:r>
           </w:p>
         </w:tc>
@@ -8767,7 +9116,7 @@
                 <w:sz w:val="20"/>
                 <w:szCs w:val="20"/>
               </w:rPr>
-              <w:t xml:space="preserve">Invisible para los enemigos. Se rompe al atacar o al recibir daño.</w:t>
+              <w:t xml:space="preserve">Ralentización.</w:t>
             </w:r>
           </w:p>
         </w:tc>
@@ -8793,7 +9142,7 @@
                 <w:sz w:val="18"/>
                 <w:szCs w:val="18"/>
               </w:rPr>
-              <w:t xml:space="preserve">Status_GuaranteedCrit</w:t>
+              <w:t xml:space="preserve">Status_Invisible</w:t>
             </w:r>
           </w:p>
         </w:tc>
@@ -8816,7 +9165,7 @@
                 <w:sz w:val="20"/>
                 <w:szCs w:val="20"/>
               </w:rPr>
-              <w:t xml:space="preserve">El próximo golpe es crítico sí o sí; se consume al usarlo.</w:t>
+              <w:t xml:space="preserve">Invisible para los enemigos. Se rompe al atacar o al recibir daño.</w:t>
             </w:r>
           </w:p>
         </w:tc>
@@ -8842,7 +9191,7 @@
                 <w:sz w:val="18"/>
                 <w:szCs w:val="18"/>
               </w:rPr>
-              <w:t xml:space="preserve">Status_Blinded</w:t>
+              <w:t xml:space="preserve">Status_GuaranteedCrit</w:t>
             </w:r>
           </w:p>
         </w:tc>
@@ -8865,7 +9214,7 @@
                 <w:sz w:val="20"/>
                 <w:szCs w:val="20"/>
               </w:rPr>
-              <w:t xml:space="preserve">Ceguera tipo flashbang.</w:t>
+              <w:t xml:space="preserve">El próximo golpe es crítico sí o sí; se consume al usarlo.</w:t>
             </w:r>
           </w:p>
         </w:tc>
@@ -8891,6 +9240,55 @@
                 <w:sz w:val="18"/>
                 <w:szCs w:val="18"/>
               </w:rPr>
+              <w:t xml:space="preserve">Status_Blinded</w:t>
+            </w:r>
+          </w:p>
+        </w:tc>
+        <w:tc>
+          <w:tcPr>
+            <w:tcW w:type="dxa" w:w="6800"/>
+            <w:tcMar>
+              <w:top w:type="dxa" w:w="60"/>
+              <w:left w:type="dxa" w:w="100"/>
+              <w:bottom w:type="dxa" w:w="60"/>
+              <w:right w:type="dxa" w:w="100"/>
+            </w:tcMar>
+          </w:tcPr>
+          <w:p>
+            <w:pPr>
+              <w:spacing w:after="0"/>
+            </w:pPr>
+            <w:r>
+              <w:rPr>
+                <w:sz w:val="20"/>
+                <w:szCs w:val="20"/>
+              </w:rPr>
+              <w:t xml:space="preserve">Ceguera tipo flashbang.</w:t>
+            </w:r>
+          </w:p>
+        </w:tc>
+      </w:tr>
+      <w:tr>
+        <w:tc>
+          <w:tcPr>
+            <w:tcW w:type="dxa" w:w="2600"/>
+            <w:tcMar>
+              <w:top w:type="dxa" w:w="60"/>
+              <w:left w:type="dxa" w:w="100"/>
+              <w:bottom w:type="dxa" w:w="60"/>
+              <w:right w:type="dxa" w:w="100"/>
+            </w:tcMar>
+          </w:tcPr>
+          <w:p>
+            <w:pPr>
+              <w:spacing w:after="0"/>
+            </w:pPr>
+            <w:r>
+              <w:rPr>
+                <w:rFonts w:ascii="Consolas" w:cs="Consolas" w:eastAsia="Consolas" w:hAnsi="Consolas"/>
+                <w:sz w:val="18"/>
+                <w:szCs w:val="18"/>
+              </w:rPr>
               <w:t xml:space="preserve">Status_Gambled</w:t>
             </w:r>
           </w:p>
@@ -8915,6 +9313,104 @@
                 <w:szCs w:val="20"/>
               </w:rPr>
               <w:t xml:space="preserve">Marca del Pirata: recibe más daño de él.</w:t>
+            </w:r>
+          </w:p>
+        </w:tc>
+      </w:tr>
+      <w:tr>
+        <w:tc>
+          <w:tcPr>
+            <w:tcW w:type="dxa" w:w="2600"/>
+            <w:tcMar>
+              <w:top w:type="dxa" w:w="60"/>
+              <w:left w:type="dxa" w:w="100"/>
+              <w:bottom w:type="dxa" w:w="60"/>
+              <w:right w:type="dxa" w:w="100"/>
+            </w:tcMar>
+          </w:tcPr>
+          <w:p>
+            <w:pPr>
+              <w:spacing w:after="0"/>
+            </w:pPr>
+            <w:r>
+              <w:rPr>
+                <w:rFonts w:ascii="Consolas" w:cs="Consolas" w:eastAsia="Consolas" w:hAnsi="Consolas"/>
+                <w:sz w:val="18"/>
+                <w:szCs w:val="18"/>
+              </w:rPr>
+              <w:t xml:space="preserve">Status_Sworn_Enemy</w:t>
+            </w:r>
+          </w:p>
+        </w:tc>
+        <w:tc>
+          <w:tcPr>
+            <w:tcW w:type="dxa" w:w="6800"/>
+            <w:tcMar>
+              <w:top w:type="dxa" w:w="60"/>
+              <w:left w:type="dxa" w:w="100"/>
+              <w:bottom w:type="dxa" w:w="60"/>
+              <w:right w:type="dxa" w:w="100"/>
+            </w:tcMar>
+          </w:tcPr>
+          <w:p>
+            <w:pPr>
+              <w:spacing w:after="0"/>
+            </w:pPr>
+            <w:r>
+              <w:rPr>
+                <w:sz w:val="20"/>
+                <w:szCs w:val="20"/>
+              </w:rPr>
+              <w:t xml:space="preserve">Enemigo jurado del Paladín: recibe más daño y cura a los aliados que lo golpean.</w:t>
+            </w:r>
+          </w:p>
+        </w:tc>
+      </w:tr>
+      <w:tr>
+        <w:tc>
+          <w:tcPr>
+            <w:tcW w:type="dxa" w:w="2600"/>
+            <w:tcMar>
+              <w:top w:type="dxa" w:w="60"/>
+              <w:left w:type="dxa" w:w="100"/>
+              <w:bottom w:type="dxa" w:w="60"/>
+              <w:right w:type="dxa" w:w="100"/>
+            </w:tcMar>
+          </w:tcPr>
+          <w:p>
+            <w:pPr>
+              <w:spacing w:after="0"/>
+            </w:pPr>
+            <w:r>
+              <w:rPr>
+                <w:rFonts w:ascii="Consolas" w:cs="Consolas" w:eastAsia="Consolas" w:hAnsi="Consolas"/>
+                <w:sz w:val="18"/>
+                <w:szCs w:val="18"/>
+              </w:rPr>
+              <w:t xml:space="preserve">Status_Avenging_Angel</w:t>
+            </w:r>
+          </w:p>
+        </w:tc>
+        <w:tc>
+          <w:tcPr>
+            <w:tcW w:type="dxa" w:w="6800"/>
+            <w:tcMar>
+              <w:top w:type="dxa" w:w="60"/>
+              <w:left w:type="dxa" w:w="100"/>
+              <w:bottom w:type="dxa" w:w="60"/>
+              <w:right w:type="dxa" w:w="100"/>
+            </w:tcMar>
+          </w:tcPr>
+          <w:p>
+            <w:pPr>
+              <w:spacing w:after="0"/>
+            </w:pPr>
+            <w:r>
+              <w:rPr>
+                <w:sz w:val="20"/>
+                <w:szCs w:val="20"/>
+              </w:rPr>
+              <w:t xml:space="preserve">Ángel vengador activo: cambia el ataque principal y enciende los anillos de aura condicionales.</w:t>
             </w:r>
           </w:p>
         </w:tc>

</xml_diff>

<commit_message>
Terminados cambios clase barbaro
</commit_message>
<xml_diff>
--- a/DesignDocuments/GAS_Arquitectura.docx
+++ b/DesignDocuments/GAS_Arquitectura.docx
@@ -1601,23 +1601,7 @@
                 <w:sz w:val="20"/>
                 <w:szCs w:val="20"/>
               </w:rPr>
-              <w:t xml:space="preserve">Escala con la vida </w:t>
-            </w:r>
-            <w:r>
-              <w:rPr>
-                <w:b/>
-                <w:bCs/>
-                <w:sz w:val="20"/>
-                <w:szCs w:val="20"/>
-              </w:rPr>
-              <w:t xml:space="preserve">del objetivo</w:t>
-            </w:r>
-            <w:r>
-              <w:rPr>
-                <w:sz w:val="20"/>
-                <w:szCs w:val="20"/>
-              </w:rPr>
-              <w:t xml:space="preserve"> (actual / máxima / faltante). Solo en efectos instantáneos.</w:t>
+              <w:t xml:space="preserve">Escala con la vida del objetivo (actual, máxima o faltante). En efectos instantáneos vale para cualquier atributo; en efectos CON duración, solo para Shield, que tiene su propio camino.</w:t>
             </w:r>
           </w:p>
         </w:tc>
@@ -1641,6 +1625,78 @@
                 <w:szCs w:val="20"/>
               </w:rPr>
               <w:t xml:space="preserve">Daño por % de la vida faltante</w:t>
+            </w:r>
+          </w:p>
+        </w:tc>
+      </w:tr>
+      <w:tr>
+        <w:tc>
+          <w:tcPr>
+            <w:tcW w:type="dxa" w:w="3000"/>
+            <w:tcMar>
+              <w:top w:type="dxa" w:w="60"/>
+              <w:left w:type="dxa" w:w="100"/>
+              <w:bottom w:type="dxa" w:w="60"/>
+              <w:right w:type="dxa" w:w="100"/>
+            </w:tcMar>
+          </w:tcPr>
+          <w:p>
+            <w:pPr>
+              <w:spacing w:after="0"/>
+            </w:pPr>
+            <w:r>
+              <w:rPr>
+                <w:rFonts w:ascii="Consolas" w:cs="Consolas" w:eastAsia="Consolas" w:hAnsi="Consolas"/>
+                <w:sz w:val="18"/>
+                <w:szCs w:val="18"/>
+              </w:rPr>
+              <w:t xml:space="preserve">MinMagnitude</w:t>
+            </w:r>
+          </w:p>
+        </w:tc>
+        <w:tc>
+          <w:tcPr>
+            <w:tcW w:type="dxa" w:w="3800"/>
+            <w:tcMar>
+              <w:top w:type="dxa" w:w="60"/>
+              <w:left w:type="dxa" w:w="100"/>
+              <w:bottom w:type="dxa" w:w="60"/>
+              <w:right w:type="dxa" w:w="100"/>
+            </w:tcMar>
+          </w:tcPr>
+          <w:p>
+            <w:pPr>
+              <w:spacing w:after="0"/>
+            </w:pPr>
+            <w:r>
+              <w:rPr>
+                <w:sz w:val="20"/>
+                <w:szCs w:val="20"/>
+              </w:rPr>
+              <w:t xml:space="preserve">Piso del resultado, ya con todos los escalados aplicados. El signo marca la dirección: positivo empuja hacia arriba, negativo hacia abajo. En 0 no hay piso.</w:t>
+            </w:r>
+          </w:p>
+        </w:tc>
+        <w:tc>
+          <w:tcPr>
+            <w:tcW w:type="dxa" w:w="2600"/>
+            <w:tcMar>
+              <w:top w:type="dxa" w:w="60"/>
+              <w:left w:type="dxa" w:w="100"/>
+              <w:bottom w:type="dxa" w:w="60"/>
+              <w:right w:type="dxa" w:w="100"/>
+            </w:tcMar>
+          </w:tcPr>
+          <w:p>
+            <w:pPr>
+              <w:spacing w:after="0"/>
+            </w:pPr>
+            <w:r>
+              <w:rPr>
+                <w:sz w:val="20"/>
+                <w:szCs w:val="20"/>
+              </w:rPr>
+              <w:t xml:space="preserve">Escudo que a vida llena valdría 0 y nunca llega a verse</w:t>
             </w:r>
           </w:p>
         </w:tc>
@@ -3326,7 +3382,7 @@
                 <w:sz w:val="20"/>
                 <w:szCs w:val="20"/>
               </w:rPr>
-              <w:t xml:space="preserve">+ daño mágico</w:t>
+              <w:t xml:space="preserve">Tipo de daño</w:t>
             </w:r>
           </w:p>
         </w:tc>
@@ -3349,7 +3405,7 @@
                 <w:sz w:val="20"/>
                 <w:szCs w:val="20"/>
               </w:rPr>
-              <w:t xml:space="preserve">Se suma el stat </w:t>
+              <w:t xml:space="preserve">El modificador es MÁGICO si escala de </w:t>
             </w:r>
             <w:r>
               <w:rPr>
@@ -3364,7 +3420,7 @@
                 <w:sz w:val="20"/>
                 <w:szCs w:val="20"/>
               </w:rPr>
-              <w:t xml:space="preserve"> del atacante como bloque aparte. No pasa por el crítico.</w:t>
+              <w:t xml:space="preserve">; físico en cualquier otro caso. Ya no hay bono automático por golpe: un impacto es de un tipo o del otro. Y al ser un modificador normal como cualquier otro, el daño mágico SÍ pasa por el crítico.</w:t>
             </w:r>
           </w:p>
         </w:tc>
@@ -4433,7 +4489,7 @@
         <w:t xml:space="preserve">LifeSteal</w:t>
       </w:r>
       <w:r>
-        <w:t xml:space="preserve"> 20 %, golpeando por la espalda. Objetivo con Vida 100, Escudo 30, sin defensas. Modificador de −5 escalado con Ataque (coeficiente −1):</w:t>
+        <w:t xml:space="preserve"> 20 %, golpeando por la espalda. Objetivo con Vida 100, Escudo 30, sin defensas. El golpe aplica DOS efectos, ambos con coeficiente −1: uno de −5 escalado con Ataque, y otro escalado con MagicDamage:</w:t>
       </w:r>
     </w:p>
     <w:tbl>
@@ -4556,7 +4612,7 @@
                 <w:sz w:val="20"/>
                 <w:szCs w:val="20"/>
               </w:rPr>
-              <w:t xml:space="preserve">1. Base</w:t>
+              <w:t xml:space="preserve">1. Base física</w:t>
             </w:r>
           </w:p>
         </w:tc>
@@ -4627,7 +4683,7 @@
                 <w:sz w:val="20"/>
                 <w:szCs w:val="20"/>
               </w:rPr>
-              <w:t xml:space="preserve">2. Crítico</w:t>
+              <w:t xml:space="preserve">2. Base mágica</w:t>
             </w:r>
           </w:p>
         </w:tc>
@@ -4650,7 +4706,7 @@
                 <w:sz w:val="20"/>
                 <w:szCs w:val="20"/>
               </w:rPr>
-              <w:t xml:space="preserve">espalda ×2</w:t>
+              <w:t xml:space="preserve">0 + (10 × −1), del efecto que escala de MagicDamage</w:t>
             </w:r>
           </w:p>
         </w:tc>
@@ -4673,7 +4729,7 @@
                 <w:sz w:val="20"/>
                 <w:szCs w:val="20"/>
               </w:rPr>
-              <w:t xml:space="preserve">físico 50</w:t>
+              <w:t xml:space="preserve">mágico 10</w:t>
             </w:r>
           </w:p>
         </w:tc>
@@ -4698,7 +4754,7 @@
                 <w:sz w:val="20"/>
                 <w:szCs w:val="20"/>
               </w:rPr>
-              <w:t xml:space="preserve">3. + mágico</w:t>
+              <w:t xml:space="preserve">3. Crítico</w:t>
             </w:r>
           </w:p>
         </w:tc>
@@ -4721,7 +4777,7 @@
                 <w:sz w:val="20"/>
                 <w:szCs w:val="20"/>
               </w:rPr>
-              <w:t xml:space="preserve">plano del atacante</w:t>
+              <w:t xml:space="preserve">espalda ×2 — ahora también al mágico</w:t>
             </w:r>
           </w:p>
         </w:tc>
@@ -4744,7 +4800,7 @@
                 <w:sz w:val="20"/>
                 <w:szCs w:val="20"/>
               </w:rPr>
-              <w:t xml:space="preserve">físico 50 · mágico 10</w:t>
+              <w:t xml:space="preserve">físico 50 · mágico 20</w:t>
             </w:r>
           </w:p>
         </w:tc>
@@ -4863,7 +4919,7 @@
                 <w:sz w:val="20"/>
                 <w:szCs w:val="20"/>
               </w:rPr>
-              <w:t xml:space="preserve">magia: bloquear 10 cuesta 20 → escudo 10, magia 0. Físico: escudo 10 frena 10 → físico 40</w:t>
+              <w:t xml:space="preserve">la magia primero: frenar 20 costaría 40 y solo hay 30, así que frena 15 y pasan 5. El escudo queda en 0, y el físico entra entero</w:t>
             </w:r>
           </w:p>
         </w:tc>
@@ -4886,7 +4942,7 @@
                 <w:sz w:val="20"/>
                 <w:szCs w:val="20"/>
               </w:rPr>
-              <w:t xml:space="preserve">escudo 0, pasan 40</w:t>
+              <w:t xml:space="preserve">escudo 0, pasan 55</w:t>
             </w:r>
           </w:p>
         </w:tc>
@@ -4934,7 +4990,7 @@
                 <w:sz w:val="20"/>
                 <w:szCs w:val="20"/>
               </w:rPr>
-              <w:t xml:space="preserve">100 − 40</w:t>
+              <w:t xml:space="preserve">100 − 55</w:t>
             </w:r>
           </w:p>
         </w:tc>
@@ -4957,7 +5013,7 @@
                 <w:sz w:val="20"/>
                 <w:szCs w:val="20"/>
               </w:rPr>
-              <w:t xml:space="preserve">Vida 60</w:t>
+              <w:t xml:space="preserve">Vida 45</w:t>
             </w:r>
           </w:p>
         </w:tc>
@@ -5005,7 +5061,7 @@
                 <w:sz w:val="20"/>
                 <w:szCs w:val="20"/>
               </w:rPr>
-              <w:t xml:space="preserve">40 × 0.20</w:t>
+              <w:t xml:space="preserve">55 × 0.20</w:t>
             </w:r>
           </w:p>
         </w:tc>
@@ -5028,7 +5084,7 @@
                 <w:sz w:val="20"/>
                 <w:szCs w:val="20"/>
               </w:rPr>
-              <w:t xml:space="preserve">atacante +8 de vida</w:t>
+              <w:t xml:space="preserve">atacante +11 de vida</w:t>
             </w:r>
           </w:p>
         </w:tc>
@@ -5039,7 +5095,7 @@
         <w:spacing w:after="120" w:line="276"/>
       </w:pPr>
       <w:r>
-        <w:t xml:space="preserve">Lo clave: el escudo de 30 solo frenó 20 de daño, porque la magia se lo comió al doble. Eso es la penetración mágica.</w:t>
+        <w:t xml:space="preserve">Lo clave: el escudo de 30 solo frenó 15 de daño, porque la magia se lo comió al doble. Eso es la penetración mágica.</w:t>
       </w:r>
     </w:p>
     <w:p>
@@ -7362,7 +7418,7 @@
                 <w:sz w:val="20"/>
                 <w:szCs w:val="20"/>
               </w:rPr>
-              <w:t xml:space="preserve">Daño mágico base. Penetra escudos e ignora la Defensa.</w:t>
+              <w:t xml:space="preserve">Daño mágico base. Penetra escudos (cuesta el doble frenarlo) e ignora la Defensa. NO se suma solo a cada golpe: solo pega cuando una habilidad lleva un efecto cuyo modificador escala de este atributo. Eso es lo que deja que una misma clase pegue físico con el arma y mágico con sus hechizos.</w:t>
             </w:r>
           </w:p>
         </w:tc>
@@ -9534,6 +9590,55 @@
                 <w:sz w:val="18"/>
                 <w:szCs w:val="18"/>
               </w:rPr>
+              <w:t xml:space="preserve">Status_Channeling</w:t>
+            </w:r>
+          </w:p>
+        </w:tc>
+        <w:tc>
+          <w:tcPr>
+            <w:tcW w:type="dxa" w:w="6800"/>
+            <w:tcMar>
+              <w:top w:type="dxa" w:w="60"/>
+              <w:left w:type="dxa" w:w="100"/>
+              <w:bottom w:type="dxa" w:w="60"/>
+              <w:right w:type="dxa" w:w="100"/>
+            </w:tcMar>
+          </w:tcPr>
+          <w:p>
+            <w:pPr>
+              <w:spacing w:after="0"/>
+            </w:pPr>
+            <w:r>
+              <w:rPr>
+                <w:sz w:val="20"/>
+                <w:szCs w:val="20"/>
+              </w:rPr>
+              <w:t xml:space="preserve">Habilidad canalizada en curso (el molinete del bárbaro). Mientras dure, CanActivate bloquea toda otra habilidad salvo las marcadas con UsableWhileChanneling.</w:t>
+            </w:r>
+          </w:p>
+        </w:tc>
+      </w:tr>
+      <w:tr>
+        <w:tc>
+          <w:tcPr>
+            <w:tcW w:type="dxa" w:w="2600"/>
+            <w:tcMar>
+              <w:top w:type="dxa" w:w="60"/>
+              <w:left w:type="dxa" w:w="100"/>
+              <w:bottom w:type="dxa" w:w="60"/>
+              <w:right w:type="dxa" w:w="100"/>
+            </w:tcMar>
+          </w:tcPr>
+          <w:p>
+            <w:pPr>
+              <w:spacing w:after="0"/>
+            </w:pPr>
+            <w:r>
+              <w:rPr>
+                <w:rFonts w:ascii="Consolas" w:cs="Consolas" w:eastAsia="Consolas" w:hAnsi="Consolas"/>
+                <w:sz w:val="18"/>
+                <w:szCs w:val="18"/>
+              </w:rPr>
               <w:t xml:space="preserve">Status_Buff_*</w:t>
             </w:r>
             <w:r>
@@ -10256,6 +10361,104 @@
                 <w:szCs w:val="20"/>
               </w:rPr>
               <w:t xml:space="preserve">Presionar activa, soltar termina (ver 6.3).</w:t>
+            </w:r>
+          </w:p>
+        </w:tc>
+      </w:tr>
+      <w:tr>
+        <w:tc>
+          <w:tcPr>
+            <w:tcW w:type="dxa" w:w="2800"/>
+            <w:tcMar>
+              <w:top w:type="dxa" w:w="60"/>
+              <w:left w:type="dxa" w:w="100"/>
+              <w:bottom w:type="dxa" w:w="60"/>
+              <w:right w:type="dxa" w:w="100"/>
+            </w:tcMar>
+          </w:tcPr>
+          <w:p>
+            <w:pPr>
+              <w:spacing w:after="0"/>
+            </w:pPr>
+            <w:r>
+              <w:rPr>
+                <w:rFonts w:ascii="Consolas" w:cs="Consolas" w:eastAsia="Consolas" w:hAnsi="Consolas"/>
+                <w:sz w:val="18"/>
+                <w:szCs w:val="18"/>
+              </w:rPr>
+              <w:t xml:space="preserve">ILeapAbility</w:t>
+            </w:r>
+          </w:p>
+        </w:tc>
+        <w:tc>
+          <w:tcPr>
+            <w:tcW w:type="dxa" w:w="6600"/>
+            <w:tcMar>
+              <w:top w:type="dxa" w:w="60"/>
+              <w:left w:type="dxa" w:w="100"/>
+              <w:bottom w:type="dxa" w:w="60"/>
+              <w:right w:type="dxa" w:w="100"/>
+            </w:tcMar>
+          </w:tcPr>
+          <w:p>
+            <w:pPr>
+              <w:spacing w:after="0"/>
+            </w:pPr>
+            <w:r>
+              <w:rPr>
+                <w:sz w:val="20"/>
+                <w:szCs w:val="20"/>
+              </w:rPr>
+              <w:t xml:space="preserve">Salto con animación sostenida: despegue ▸ bucle en el aire ▸ aterrizaje. El bucle lo corta IsJumping, así que el aterrizaje se detecta solo.</w:t>
+            </w:r>
+          </w:p>
+        </w:tc>
+      </w:tr>
+      <w:tr>
+        <w:tc>
+          <w:tcPr>
+            <w:tcW w:type="dxa" w:w="2800"/>
+            <w:tcMar>
+              <w:top w:type="dxa" w:w="60"/>
+              <w:left w:type="dxa" w:w="100"/>
+              <w:bottom w:type="dxa" w:w="60"/>
+              <w:right w:type="dxa" w:w="100"/>
+            </w:tcMar>
+          </w:tcPr>
+          <w:p>
+            <w:pPr>
+              <w:spacing w:after="0"/>
+            </w:pPr>
+            <w:r>
+              <w:rPr>
+                <w:rFonts w:ascii="Consolas" w:cs="Consolas" w:eastAsia="Consolas" w:hAnsi="Consolas"/>
+                <w:sz w:val="18"/>
+                <w:szCs w:val="18"/>
+              </w:rPr>
+              <w:t xml:space="preserve">IChanneledAbility</w:t>
+            </w:r>
+          </w:p>
+        </w:tc>
+        <w:tc>
+          <w:tcPr>
+            <w:tcW w:type="dxa" w:w="6600"/>
+            <w:tcMar>
+              <w:top w:type="dxa" w:w="60"/>
+              <w:left w:type="dxa" w:w="100"/>
+              <w:bottom w:type="dxa" w:w="60"/>
+              <w:right w:type="dxa" w:w="100"/>
+            </w:tcMar>
+          </w:tcPr>
+          <w:p>
+            <w:pPr>
+              <w:spacing w:after="0"/>
+            </w:pPr>
+            <w:r>
+              <w:rPr>
+                <w:sz w:val="20"/>
+                <w:szCs w:val="20"/>
+              </w:rPr>
+              <w:t xml:space="preserve">Canalizado por TIEMPO (no por botón): arranque ▸ bucle ▸ remate. Reusa las ranuras del mantenido en el Animator, sin estados nuevos.</w:t>
             </w:r>
           </w:p>
         </w:tc>

</xml_diff>

<commit_message>
Revisiones terminadas (por ahora)
</commit_message>
<xml_diff>
--- a/DesignDocuments/GAS_Arquitectura.docx
+++ b/DesignDocuments/GAS_Arquitectura.docx
@@ -1673,7 +1673,7 @@
                 <w:sz w:val="20"/>
                 <w:szCs w:val="20"/>
               </w:rPr>
-              <w:t xml:space="preserve">Piso del resultado, ya con todos los escalados aplicados. El signo marca la dirección: positivo empuja hacia arriba, negativo hacia abajo. En 0 no hay piso.</w:t>
+              <w:t xml:space="preserve">Piso del resultado en VALOR ABSOLUTO, ya con todos los escalados aplicados. Se aplica en la dirección que el modificador YA tiene, así que poner 1 en un efecto de daño significa «al menos 1 de daño» y no «+1 de vida»: el signo que escribas no importa. En 0 no hay piso.</w:t>
             </w:r>
           </w:p>
         </w:tc>
@@ -2859,6 +2859,23 @@
           <w:szCs w:val="20"/>
         </w:rPr>
         <w:t xml:space="preserve">El evento es solo una MARCA DE TIEMPO leída del asset por el servidor. Nada depende de que un cliente reporte nada — sería inseguro.</w:t>
+      </w:r>
+    </w:p>
+    <w:p>
+      <w:pPr>
+        <w:pBdr>
+          <w:left w:val="single" w:color="E0A800" w:sz="14" w:space="6"/>
+        </w:pBdr>
+        <w:shd w:fill="FFF6DA" w:val="clear"/>
+        <w:spacing w:after="160" w:before="100"/>
+        <w:ind w:left="144" w:right="144"/>
+      </w:pPr>
+      <w:r>
+        <w:rPr>
+          <w:sz w:val="20"/>
+          <w:szCs w:val="20"/>
+        </w:rPr>
+        <w:t xml:space="preserve">Además de la ranura de acción (un clip suelto) hay tres juegos de ranuras de INICIO ▸ BUCLE ▸ FINAL, para animaciones que duran lo que dure algo y no lo que dure el clip: MANTENER (IHoldAbility, sostenida por el botón), SALTO (ILeapAbility, cortada por IsJumping al aterrizar) y CANALIZADO (IChanneledAbility, cortada por tiempo). Las tres comparten los mismos estados del Animator: un canalizado reusa las ranuras del mantenido, así que no hay estados nuevos que crear.</w:t>
       </w:r>
     </w:p>
     <w:p>
@@ -10624,6 +10641,23 @@
     </w:p>
     <w:p>
       <w:pPr>
+        <w:pBdr>
+          <w:left w:val="single" w:color="E0A800" w:sz="14" w:space="6"/>
+        </w:pBdr>
+        <w:shd w:fill="FFF6DA" w:val="clear"/>
+        <w:spacing w:after="160" w:before="100"/>
+        <w:ind w:left="144" w:right="144"/>
+      </w:pPr>
+      <w:r>
+        <w:rPr>
+          <w:sz w:val="20"/>
+          <w:szCs w:val="20"/>
+        </w:rPr>
+        <w:t xml:space="preserve">Otra trampa, al elegir objetivos desde una pasiva: el filtro de enemigos (IsEnemyOf) es por EQUIPO, y los NPCs del modo Mercenarios son el equipo 4 — o sea que cuentan como hostiles y entran en cualquier sorteo. Si la pasiva solo debe apuntar a jugadores, filtrá por PlayerController y no por número de equipo: así los NPCs que agregues después quedan fuera solos.</w:t>
+      </w:r>
+    </w:p>
+    <w:p>
+      <w:pPr>
         <w:pStyle w:val="Heading1"/>
         <w:spacing w:after="160" w:before="360"/>
       </w:pPr>
@@ -10851,6 +10885,32 @@
       </w:r>
       <w:r>
         <w:t xml:space="preserve">.</w:t>
+      </w:r>
+    </w:p>
+    <w:p>
+      <w:pPr>
+        <w:pStyle w:val="ListParagraph"/>
+        <w:numPr>
+          <w:ilvl w:val="0"/>
+          <w:numId w:val="2"/>
+        </w:numPr>
+        <w:spacing w:after="60"/>
+      </w:pPr>
+      <w:r>
+        <w:t xml:space="preserve">Confundir el YAW del cuerpo con el PUNTO de mira. El cuerpo se alinea con la CÁMARA; el punto apuntado solo aporta la inclinación. Girar hacia el punto abre el cuerpo hacia el lado del hombro, y más cuanto más cerca esté lo apuntado.</w:t>
+      </w:r>
+    </w:p>
+    <w:p>
+      <w:pPr>
+        <w:pStyle w:val="ListParagraph"/>
+        <w:numPr>
+          <w:ilvl w:val="0"/>
+          <w:numId w:val="2"/>
+        </w:numPr>
+        <w:spacing w:after="60"/>
+      </w:pPr>
+      <w:r>
+        <w:t xml:space="preserve">Crear un collider por código sin asignarle capa: cae en Default y aparece en todos los raycasts que filtran por capa — la oclusión de las barras de vida y el rayo de la mira, entre otros.</w:t>
       </w:r>
     </w:p>
     <w:p>

</xml_diff>